<commit_message>
Use full plain URLs in final report
</commit_message>
<xml_diff>
--- a/frontend/docs/evidence/VeilPass_Final_Report_2026-09-30.docx
+++ b/frontend/docs/evidence/VeilPass_Final_Report_2026-09-30.docx
@@ -3368,7 +3368,11 @@
                 <w:sz w:val="16"/>
                 <w:u w:val="none"/>
               </w:rPr>
-              <w:t>frontend/docs/evidence/delivery-status.md; frontend/docs/evidence/live-acceptance-checklist.md</w:t>
+              <w:t>https://github.com/irham3/veilpass/blob/master/frontend/docs/evidence/delivery-status.md</w:t>
+            </w:r>
+            <w:r>
+              <w:br/>
+              <w:t>https://github.com/irham3/veilpass/blob/master/frontend/docs/evidence/live-acceptance-checklist.md</w:t>
             </w:r>
           </w:p>
         </w:tc>
@@ -3479,7 +3483,7 @@
                 <w:sz w:val="16"/>
                 <w:u w:val="none"/>
               </w:rPr>
-              <w:t>frontend/docs/evidence/release-v0.2.2-verification-2026-09-29.md</w:t>
+              <w:t>https://github.com/irham3/veilpass/blob/master/frontend/docs/evidence/release-v0.2.2-verification-2026-09-29.md</w:t>
             </w:r>
           </w:p>
         </w:tc>
@@ -3590,7 +3594,7 @@
                 <w:sz w:val="16"/>
                 <w:u w:val="none"/>
               </w:rPr>
-              <w:t>frontend/docs/evidence/npm-consumer-install-2026-09-30.md</w:t>
+              <w:t>https://github.com/irham3/veilpass/blob/master/frontend/docs/evidence/npm-consumer-install-2026-09-30.md</w:t>
             </w:r>
           </w:p>
         </w:tc>
@@ -3701,7 +3705,7 @@
                 <w:sz w:val="16"/>
                 <w:u w:val="none"/>
               </w:rPr>
-              <w:t>frontend/examples/two-origin-dapp/README.md</w:t>
+              <w:t>https://github.com/irham3/veilpass/blob/master/frontend/examples/two-origin-dapp/README.md</w:t>
             </w:r>
           </w:p>
         </w:tc>
@@ -3812,7 +3816,15 @@
                 <w:sz w:val="16"/>
                 <w:u w:val="none"/>
               </w:rPr>
-              <w:t>https://veilpass.dev/docs/quickstart; https://veilpass.dev/docs/client; https://veilpass.dev/docs/server</w:t>
+              <w:t>https://veilpass.dev/docs/quickstart</w:t>
+            </w:r>
+            <w:r>
+              <w:br/>
+              <w:t>https://veilpass.dev/docs/client</w:t>
+            </w:r>
+            <w:r>
+              <w:br/>
+              <w:t>https://veilpass.dev/docs/server</w:t>
             </w:r>
           </w:p>
         </w:tc>
@@ -3923,7 +3935,15 @@
                 <w:sz w:val="16"/>
                 <w:u w:val="none"/>
               </w:rPr>
-              <w:t>https://app-a.veilpass.dev; https://app-b.veilpass.dev; frontend/docs/demo-guide.md</w:t>
+              <w:t>https://app-a.veilpass.dev</w:t>
+            </w:r>
+            <w:r>
+              <w:br/>
+              <w:t>https://app-b.veilpass.dev</w:t>
+            </w:r>
+            <w:r>
+              <w:br/>
+              <w:t>https://github.com/irham3/veilpass/blob/master/frontend/docs/demo-guide.md</w:t>
             </w:r>
           </w:p>
         </w:tc>
@@ -4034,7 +4054,7 @@
                 <w:sz w:val="16"/>
                 <w:u w:val="none"/>
               </w:rPr>
-              <w:t>frontend/docs/evidence/test-report.md</w:t>
+              <w:t>https://github.com/irham3/veilpass/blob/master/frontend/docs/evidence/test-report.md</w:t>
             </w:r>
           </w:p>
         </w:tc>
@@ -4145,7 +4165,7 @@
                 <w:sz w:val="16"/>
                 <w:u w:val="none"/>
               </w:rPr>
-              <w:t>frontend/docs/evidence/live-acceptance-checklist.md</w:t>
+              <w:t>https://github.com/irham3/veilpass/blob/master/frontend/docs/evidence/live-acceptance-checklist.md</w:t>
             </w:r>
           </w:p>
         </w:tc>
@@ -4256,7 +4276,11 @@
                 <w:sz w:val="16"/>
                 <w:u w:val="none"/>
               </w:rPr>
-              <w:t>https://veilpass.dev/docs; frontend/lib/docs/content.ts</w:t>
+              <w:t>https://veilpass.dev/docs</w:t>
+            </w:r>
+            <w:r>
+              <w:br/>
+              <w:t>https://github.com/irham3/veilpass/blob/master/frontend/lib/docs/content.ts</w:t>
             </w:r>
           </w:p>
         </w:tc>
@@ -4367,7 +4391,7 @@
                 <w:sz w:val="16"/>
                 <w:u w:val="none"/>
               </w:rPr>
-              <w:t>frontend/docs/evidence/live-acceptance-checklist.md</w:t>
+              <w:t>https://github.com/irham3/veilpass/blob/master/frontend/docs/evidence/live-acceptance-checklist.md</w:t>
             </w:r>
           </w:p>
         </w:tc>
@@ -4478,7 +4502,7 @@
                 <w:sz w:val="16"/>
                 <w:u w:val="none"/>
               </w:rPr>
-              <w:t>frontend/docs/evidence/host-network-capture-redacted-2026-09-29.md</w:t>
+              <w:t>https://github.com/irham3/veilpass/blob/master/frontend/docs/evidence/host-network-capture-redacted-2026-09-29.md</w:t>
             </w:r>
           </w:p>
         </w:tc>
@@ -4553,9 +4577,13 @@
           </w:tcPr>
           <w:p>
             <w:r>
-              <w:t>Local file: frontend/docs/evidence/VeilPass_Developer_Explainer_EN_2026-09-30.mp4</w:t>
+              <w:t>https://github.com/irham3/veilpass/blob/master/frontend/docs/evidence/VeilPass_Developer_Explainer_EN_2026-09-30.mp4</w:t>
+            </w:r>
+            <w:r>
               <w:br/>
-              <w:t>Timed captions: frontend/docs/evidence/VeilPass_Developer_Explainer_EN_2026-09-30.srt</w:t>
+              <w:t>https://github.com/irham3/veilpass/blob/master/frontend/docs/evidence/VeilPass_Developer_Explainer_EN_2026-09-30.srt</w:t>
+            </w:r>
+            <w:r>
               <w:br/>
               <w:t>Upload URL: ______________________________</w:t>
             </w:r>

</xml_diff>